<commit_message>
Adiciona integrante Rafael Ferreira
</commit_message>
<xml_diff>
--- a/especificacao.docx
+++ b/especificacao.docx
@@ -257,6 +257,68 @@
                 <w:szCs w:val="22"/>
               </w:rPr>
               <w:t xml:space="preserve">23024986</w:t>
+            </w:r>
+          </w:p>
+        </w:tc>
+      </w:tr>
+      <w:tr>
+        <w:tc>
+          <w:tcPr>
+            <w:tcW w:type="dxa" w:w="7200"/>
+            <w:tcBorders>
+              <w:top w:val="single" w:color="C8CCD8" w:sz="4"/>
+              <w:left w:val="single" w:color="C8CCD8" w:sz="4"/>
+              <w:bottom w:val="single" w:color="C8CCD8" w:sz="4"/>
+              <w:right w:val="single" w:color="C8CCD8" w:sz="4"/>
+            </w:tcBorders>
+            <w:tcMar>
+              <w:top w:type="dxa" w:w="60"/>
+              <w:left w:type="dxa" w:w="100"/>
+              <w:bottom w:type="dxa" w:w="60"/>
+              <w:right w:type="dxa" w:w="100"/>
+            </w:tcMar>
+          </w:tcPr>
+          <w:p>
+            <w:pPr>
+              <w:spacing w:after="0"/>
+            </w:pPr>
+            <w:r>
+              <w:rPr>
+                <w:rFonts w:ascii="Calibri" w:cs="Calibri" w:eastAsia="Calibri" w:hAnsi="Calibri"/>
+                <w:sz w:val="22"/>
+                <w:szCs w:val="22"/>
+              </w:rPr>
+              <w:t xml:space="preserve">Rafael Ferreira</w:t>
+            </w:r>
+          </w:p>
+        </w:tc>
+        <w:tc>
+          <w:tcPr>
+            <w:tcW w:type="dxa" w:w="2438"/>
+            <w:tcBorders>
+              <w:top w:val="single" w:color="C8CCD8" w:sz="4"/>
+              <w:left w:val="single" w:color="C8CCD8" w:sz="4"/>
+              <w:bottom w:val="single" w:color="C8CCD8" w:sz="4"/>
+              <w:right w:val="single" w:color="C8CCD8" w:sz="4"/>
+            </w:tcBorders>
+            <w:tcMar>
+              <w:top w:type="dxa" w:w="60"/>
+              <w:left w:type="dxa" w:w="100"/>
+              <w:bottom w:type="dxa" w:w="60"/>
+              <w:right w:type="dxa" w:w="100"/>
+            </w:tcMar>
+          </w:tcPr>
+          <w:p>
+            <w:pPr>
+              <w:spacing w:after="0"/>
+            </w:pPr>
+            <w:r>
+              <w:rPr>
+                <w:rFonts w:ascii="Calibri" w:cs="Calibri" w:eastAsia="Calibri" w:hAnsi="Calibri"/>
+                <w:sz w:val="22"/>
+                <w:szCs w:val="22"/>
+              </w:rPr>
+              <w:t xml:space="preserve">23024975</w:t>
             </w:r>
           </w:p>
         </w:tc>

</xml_diff>

<commit_message>
Adiciona integrante Yasmin Ribeiro
</commit_message>
<xml_diff>
--- a/especificacao.docx
+++ b/especificacao.docx
@@ -319,6 +319,68 @@
                 <w:szCs w:val="22"/>
               </w:rPr>
               <w:t xml:space="preserve">23024975</w:t>
+            </w:r>
+          </w:p>
+        </w:tc>
+      </w:tr>
+      <w:tr>
+        <w:tc>
+          <w:tcPr>
+            <w:tcW w:type="dxa" w:w="7200"/>
+            <w:tcBorders>
+              <w:top w:val="single" w:color="C8CCD8" w:sz="4"/>
+              <w:left w:val="single" w:color="C8CCD8" w:sz="4"/>
+              <w:bottom w:val="single" w:color="C8CCD8" w:sz="4"/>
+              <w:right w:val="single" w:color="C8CCD8" w:sz="4"/>
+            </w:tcBorders>
+            <w:tcMar>
+              <w:top w:type="dxa" w:w="60"/>
+              <w:left w:type="dxa" w:w="100"/>
+              <w:bottom w:type="dxa" w:w="60"/>
+              <w:right w:type="dxa" w:w="100"/>
+            </w:tcMar>
+          </w:tcPr>
+          <w:p>
+            <w:pPr>
+              <w:spacing w:after="0"/>
+            </w:pPr>
+            <w:r>
+              <w:rPr>
+                <w:rFonts w:ascii="Calibri" w:cs="Calibri" w:eastAsia="Calibri" w:hAnsi="Calibri"/>
+                <w:sz w:val="22"/>
+                <w:szCs w:val="22"/>
+              </w:rPr>
+              <w:t xml:space="preserve">Yasmin Ribeiro</w:t>
+            </w:r>
+          </w:p>
+        </w:tc>
+        <w:tc>
+          <w:tcPr>
+            <w:tcW w:type="dxa" w:w="2438"/>
+            <w:tcBorders>
+              <w:top w:val="single" w:color="C8CCD8" w:sz="4"/>
+              <w:left w:val="single" w:color="C8CCD8" w:sz="4"/>
+              <w:bottom w:val="single" w:color="C8CCD8" w:sz="4"/>
+              <w:right w:val="single" w:color="C8CCD8" w:sz="4"/>
+            </w:tcBorders>
+            <w:tcMar>
+              <w:top w:type="dxa" w:w="60"/>
+              <w:left w:type="dxa" w:w="100"/>
+              <w:bottom w:type="dxa" w:w="60"/>
+              <w:right w:type="dxa" w:w="100"/>
+            </w:tcMar>
+          </w:tcPr>
+          <w:p>
+            <w:pPr>
+              <w:spacing w:after="0"/>
+            </w:pPr>
+            <w:r>
+              <w:rPr>
+                <w:rFonts w:ascii="Calibri" w:cs="Calibri" w:eastAsia="Calibri" w:hAnsi="Calibri"/>
+                <w:sz w:val="22"/>
+                <w:szCs w:val="22"/>
+              </w:rPr>
+              <w:t xml:space="preserve">23024985</w:t>
             </w:r>
           </w:p>
         </w:tc>

</xml_diff>